<commit_message>
Adjust greetings for MarketPro and Ikon Search's generic inboxes
Both firms use role-based addresses (talentagent@marketproinc.com,
info@ikonsearch.com), confirmed live via each firm's own site, not
a named contact. "Hi [Name]," doesn't work there, so both now greet
the team directly instead. Method Recruiting and Talentfoot keep the
[Name] placeholder since named contacts are still possible there.

Co-Authored-By: Claude Sonnet 5 <noreply@anthropic.com>
Claude-Session: https://claude.ai/code/session_01HGwMf3WQEWpBH5LDYWi1id
</commit_message>
<xml_diff>
--- a/Taylor-Bornstein-Outreach-Ikon-Search.docx
+++ b/Taylor-Bornstein-Outreach-Ikon-Search.docx
@@ -27,7 +27,7 @@
           <w:sz w:val="22"/>
           <w:szCs w:val="22"/>
         </w:rPr>
-        <w:t xml:space="preserve">Hi [Name],</w:t>
+        <w:t xml:space="preserve">Hi Ikon Search team,</w:t>
       </w:r>
     </w:p>
     <w:p>
@@ -122,7 +122,7 @@
       </w:r>
     </w:p>
     <w:p>
-      <w:hyperlink w:history="1" r:id="rIdkhyftqrstrf0hx-_qtet0">
+      <w:hyperlink w:history="1" r:id="rIdvkxg16m3hndzlxjy58lhy">
         <w:r>
           <w:rPr>
             <w:rStyle w:val="Hyperlink"/>

</xml_diff>

<commit_message>
Update Ikon Search hook to lead with recruiter track record
Replaces the "you explicitly recruit Directors of Content Marketing"
line with a more direct pitch: recruiters landed the last three jobs,
want to be in their pipeline. Corrected "five-plus years" back to
six-plus to match the actual Mendix tenure used everywhere else.

Co-Authored-By: Claude Sonnet 5 <noreply@anthropic.com>
Claude-Session: https://claude.ai/code/session_01HGwMf3WQEWpBH5LDYWi1id
</commit_message>
<xml_diff>
--- a/Taylor-Bornstein-Outreach-Ikon-Search.docx
+++ b/Taylor-Bornstein-Outreach-Ikon-Search.docx
@@ -40,7 +40,7 @@
           <w:sz w:val="22"/>
           <w:szCs w:val="22"/>
         </w:rPr>
-        <w:t xml:space="preserve">I'm a Director-level content and communications leader at Bolt.new. I started here after six-plus years scaling the Mendix content org from the ground up. You explicitly recruit Directors of Content Marketing, which is exactly my title and level. I wanted to make sure I'm in your pipeline.</w:t>
+        <w:t xml:space="preserve">I'm a Director-level content and communications leader at Bolt.new. I started here after six-plus years scaling the Mendix content org from the ground up. I've worked with recruiters to land my last three jobs, and I want to be in your pipeline.</w:t>
       </w:r>
     </w:p>
     <w:p>
@@ -122,7 +122,7 @@
       </w:r>
     </w:p>
     <w:p>
-      <w:hyperlink w:history="1" r:id="rIdvkxg16m3hndzlxjy58lhy">
+      <w:hyperlink w:history="1" r:id="rIdc7tz4fro0hjx3cpyxnvvf">
         <w:r>
           <w:rPr>
             <w:rStyle w:val="Hyperlink"/>

</xml_diff>

<commit_message>
Correct tenure claim to five-plus years across all four letters
"Scaling the Mendix content org from the ground up" specifically
refers to the team-building work that began with the Manager
promotion in Sept 2020, not the Sept 2019 hire date. Sept 2020 to
Feb 2026 is five-plus years, not six-plus (which was measuring total
Mendix tenure, a different and broader claim than the one the
sentence actually makes).

Co-Authored-By: Claude Sonnet 5 <noreply@anthropic.com>
Claude-Session: https://claude.ai/code/session_01HGwMf3WQEWpBH5LDYWi1id
</commit_message>
<xml_diff>
--- a/Taylor-Bornstein-Outreach-Ikon-Search.docx
+++ b/Taylor-Bornstein-Outreach-Ikon-Search.docx
@@ -40,7 +40,7 @@
           <w:sz w:val="22"/>
           <w:szCs w:val="22"/>
         </w:rPr>
-        <w:t xml:space="preserve">I'm a Director-level content and communications leader at Bolt.new. I started here after six-plus years scaling the Mendix content org from the ground up. I've worked with recruiters to land my last three jobs, and I want to be in your pipeline.</w:t>
+        <w:t xml:space="preserve">I'm a Director-level content and communications leader at Bolt.new. I started here after five-plus years scaling the Mendix content org from the ground up. I've worked with recruiters to land my last three jobs, and I want to be in your pipeline.</w:t>
       </w:r>
     </w:p>
     <w:p>
@@ -122,7 +122,7 @@
       </w:r>
     </w:p>
     <w:p>
-      <w:hyperlink w:history="1" r:id="rIdc7tz4fro0hjx3cpyxnvvf">
+      <w:hyperlink w:history="1" r:id="rId5dt6ignohy1krqsddw7m6">
         <w:r>
           <w:rPr>
             <w:rStyle w:val="Hyperlink"/>

</xml_diff>